<commit_message>
idk what i've done but new docs are here
</commit_message>
<xml_diff>
--- a/Scripts_and_Docs/T323_Report.docx
+++ b/Scripts_and_Docs/T323_Report.docx
@@ -14,13 +14,13 @@
           <w:szCs w:val="24"/>
         </w:rPr>
       </w:pPr>
-      <w:bookmarkStart w:id="0" w:name="__DdeLink__534_3515432024"/>
-      <w:bookmarkStart w:id="1" w:name="__DdeLink__1137_3796888077"/>
-      <w:bookmarkStart w:id="2" w:name="__DdeLink__578_1911333986"/>
+      <w:bookmarkStart w:id="0" w:name="__DdeLink__1117_1329836782"/>
+      <w:bookmarkStart w:id="1" w:name="__DdeLink__1022_1329836782"/>
+      <w:bookmarkStart w:id="2" w:name="__DdeLink__809_1329836782"/>
       <w:bookmarkStart w:id="3" w:name="__DdeLink__635_1106364943"/>
-      <w:bookmarkStart w:id="4" w:name="__DdeLink__809_1329836782"/>
-      <w:bookmarkStart w:id="5" w:name="__DdeLink__1022_1329836782"/>
-      <w:bookmarkStart w:id="6" w:name="__DdeLink__1117_1329836782"/>
+      <w:bookmarkStart w:id="4" w:name="__DdeLink__578_1911333986"/>
+      <w:bookmarkStart w:id="5" w:name="__DdeLink__1137_3796888077"/>
+      <w:bookmarkStart w:id="6" w:name="__DdeLink__534_3515432024"/>
       <w:bookmarkEnd w:id="0"/>
       <w:bookmarkEnd w:id="1"/>
       <w:bookmarkEnd w:id="2"/>
@@ -1333,8 +1333,7 @@
         </w:rPr>
       </w:r>
       <w:bookmarkStart w:id="8" w:name="__DdeLink__1052_1329836782"/>
-      <w:bookmarkStart w:id="9" w:name="__DdeLink__1052_1329836782"/>
-      <w:bookmarkEnd w:id="9"/>
+      <w:bookmarkEnd w:id="8"/>
     </w:p>
     <w:p>
       <w:pPr>
@@ -1353,8 +1352,8 @@
           <w:szCs w:val="24"/>
         </w:rPr>
       </w:pPr>
-      <w:bookmarkStart w:id="10" w:name="__DdeLink__1045_1329836782"/>
-      <w:bookmarkEnd w:id="10"/>
+      <w:bookmarkStart w:id="9" w:name="__DdeLink__1045_1329836782"/>
+      <w:bookmarkEnd w:id="9"/>
       <w:r>
         <w:rPr>
           <w:rFonts w:ascii="Sakkal Majalla" w:hAnsi="Sakkal Majalla" w:cs="Sakkal Majalla"/>
@@ -1617,7 +1616,7 @@
         </w:rPr>
         <w:t>حكيم</w:t>
       </w:r>
-      <w:bookmarkStart w:id="11" w:name="__DdeLink__616_3796888077"/>
+      <w:bookmarkStart w:id="10" w:name="__DdeLink__616_3796888077"/>
       <w:r>
         <w:rPr>
           <w:rStyle w:val="Strong"/>
@@ -1628,7 +1627,7 @@
         </w:rPr>
         <w:t xml:space="preserve"> المؤسس</w:t>
       </w:r>
-      <w:bookmarkEnd w:id="11"/>
+      <w:bookmarkEnd w:id="10"/>
       <w:r>
         <w:rPr>
           <w:rStyle w:val="Strong"/>
@@ -2904,8 +2903,8 @@
         <w:jc w:val="start"/>
         <w:rPr/>
       </w:pPr>
+      <w:bookmarkStart w:id="11" w:name="__DdeLink__501_1423637023"/>
       <w:bookmarkStart w:id="12" w:name="__DdeLink__228_1423637023"/>
-      <w:bookmarkStart w:id="13" w:name="__DdeLink__501_1423637023"/>
       <w:r>
         <w:rPr>
           <w:rStyle w:val="Emphasis"/>
@@ -2921,8 +2920,8 @@
         </w:rPr>
         <w:t>هل يمكن للذكاء الاصطناعي الصحي أن يكون آخر خط دفاع طبي في المناطق النائية وأوقات الأزمات؟</w:t>
       </w:r>
+      <w:bookmarkEnd w:id="11"/>
       <w:bookmarkEnd w:id="12"/>
-      <w:bookmarkEnd w:id="13"/>
     </w:p>
     <w:p>
       <w:pPr>
@@ -3122,8 +3121,8 @@
           <w:szCs w:val="24"/>
         </w:rPr>
       </w:pPr>
-      <w:bookmarkStart w:id="14" w:name="__DdeLink__3672_3028478877"/>
-      <w:bookmarkEnd w:id="14"/>
+      <w:bookmarkStart w:id="13" w:name="__DdeLink__3672_3028478877"/>
+      <w:bookmarkEnd w:id="13"/>
       <w:r>
         <w:rPr>
           <w:rFonts w:ascii="Sakkal Majalla" w:hAnsi="Sakkal Majalla" w:cs="Sakkal Majalla"/>
@@ -3400,9 +3399,9 @@
           <w:szCs w:val="24"/>
         </w:rPr>
       </w:pPr>
-      <w:bookmarkStart w:id="15" w:name="__DdeLink__503_1423637023"/>
-      <w:bookmarkStart w:id="16" w:name="__DdeLink__3672_3028478877_Copy_1"/>
-      <w:bookmarkEnd w:id="16"/>
+      <w:bookmarkStart w:id="14" w:name="__DdeLink__503_1423637023"/>
+      <w:bookmarkStart w:id="15" w:name="__DdeLink__3672_3028478877_Copy_1"/>
+      <w:bookmarkEnd w:id="15"/>
       <w:r>
         <w:rPr>
           <w:rFonts w:cs="Sakkal Majalla" w:ascii="Sakkal Majalla" w:hAnsi="Sakkal Majalla"/>
@@ -3412,8 +3411,8 @@
         </w:rPr>
         <w:t>_____________________________________________________________________________________________________________________</w:t>
       </w:r>
-      <w:bookmarkStart w:id="17" w:name="__DdeLink__793_1853031811"/>
-      <w:bookmarkEnd w:id="15"/>
+      <w:bookmarkStart w:id="16" w:name="__DdeLink__793_1853031811"/>
+      <w:bookmarkEnd w:id="14"/>
     </w:p>
     <w:p>
       <w:pPr>
@@ -3466,7 +3465,7 @@
         </w:rPr>
         <w:t>المواد والمنهجية</w:t>
       </w:r>
-      <w:bookmarkEnd w:id="17"/>
+      <w:bookmarkEnd w:id="16"/>
     </w:p>
     <w:p>
       <w:pPr>
@@ -4118,8 +4117,8 @@
         </w:rPr>
         <w:t>"</w:t>
       </w:r>
-      <w:bookmarkStart w:id="18" w:name="__DdeLink__1052_1329836782_Copy_1"/>
-      <w:bookmarkEnd w:id="18"/>
+      <w:bookmarkStart w:id="17" w:name="__DdeLink__1052_1329836782_Copy_1"/>
+      <w:bookmarkEnd w:id="17"/>
     </w:p>
     <w:p>
       <w:pPr>
@@ -4137,8 +4136,8 @@
           <w:szCs w:val="24"/>
         </w:rPr>
       </w:pPr>
-      <w:bookmarkStart w:id="19" w:name="__DdeLink__600_1911333986"/>
-      <w:bookmarkEnd w:id="19"/>
+      <w:bookmarkStart w:id="18" w:name="__DdeLink__600_1911333986"/>
+      <w:bookmarkEnd w:id="18"/>
       <w:r>
         <w:rPr>
           <w:rFonts w:ascii="Sakkal Majalla" w:hAnsi="Sakkal Majalla" w:cs="Sakkal Majalla"/>
@@ -4618,7 +4617,7 @@
         <w:t xml:space="preserve">يمكن مراجعة النتائج كاملة على </w:t>
       </w:r>
       <w:hyperlink r:id="rId2">
-        <w:bookmarkStart w:id="20" w:name="__DdeLink__821_3796888077"/>
+        <w:bookmarkStart w:id="19" w:name="__DdeLink__821_3796888077"/>
         <w:r>
           <w:rPr>
             <w:rStyle w:val="Hyperlink"/>
@@ -4632,7 +4631,7 @@
           <w:t>https://github.com/2kfi/Hakeem</w:t>
         </w:r>
       </w:hyperlink>
-      <w:bookmarkEnd w:id="20"/>
+      <w:bookmarkEnd w:id="19"/>
       <w:r>
         <w:rPr>
           <w:rStyle w:val="Strong"/>
@@ -4662,8 +4661,8 @@
         </w:tblCellMar>
       </w:tblPr>
       <w:tblGrid>
-        <w:gridCol w:w="1374"/>
-        <w:gridCol w:w="1356"/>
+        <w:gridCol w:w="1373"/>
+        <w:gridCol w:w="1357"/>
         <w:gridCol w:w="1525"/>
         <w:gridCol w:w="1170"/>
         <w:gridCol w:w="1985"/>
@@ -4673,7 +4672,7 @@
         <w:trPr/>
         <w:tc>
           <w:tcPr>
-            <w:tcW w:w="1374" w:type="dxa"/>
+            <w:tcW w:w="1373" w:type="dxa"/>
             <w:tcBorders>
               <w:top w:val="single" w:sz="4" w:space="0" w:color="000000"/>
               <w:start w:val="single" w:sz="4" w:space="0" w:color="000000"/>
@@ -4704,7 +4703,7 @@
         </w:tc>
         <w:tc>
           <w:tcPr>
-            <w:tcW w:w="1356" w:type="dxa"/>
+            <w:tcW w:w="1357" w:type="dxa"/>
             <w:tcBorders>
               <w:top w:val="single" w:sz="4" w:space="0" w:color="000000"/>
               <w:start w:val="single" w:sz="4" w:space="0" w:color="000000"/>
@@ -4862,7 +4861,7 @@
         <w:trPr/>
         <w:tc>
           <w:tcPr>
-            <w:tcW w:w="1374" w:type="dxa"/>
+            <w:tcW w:w="1373" w:type="dxa"/>
             <w:tcBorders>
               <w:start w:val="single" w:sz="4" w:space="0" w:color="000000"/>
               <w:bottom w:val="single" w:sz="4" w:space="0" w:color="000000"/>
@@ -4893,7 +4892,7 @@
         </w:tc>
         <w:tc>
           <w:tcPr>
-            <w:tcW w:w="1356" w:type="dxa"/>
+            <w:tcW w:w="1357" w:type="dxa"/>
             <w:tcBorders>
               <w:start w:val="single" w:sz="4" w:space="0" w:color="000000"/>
               <w:bottom w:val="single" w:sz="4" w:space="0" w:color="000000"/>
@@ -5046,7 +5045,7 @@
         <w:trPr/>
         <w:tc>
           <w:tcPr>
-            <w:tcW w:w="1374" w:type="dxa"/>
+            <w:tcW w:w="1373" w:type="dxa"/>
             <w:tcBorders>
               <w:start w:val="single" w:sz="4" w:space="0" w:color="000000"/>
               <w:bottom w:val="single" w:sz="4" w:space="0" w:color="000000"/>
@@ -5077,7 +5076,7 @@
         </w:tc>
         <w:tc>
           <w:tcPr>
-            <w:tcW w:w="1356" w:type="dxa"/>
+            <w:tcW w:w="1357" w:type="dxa"/>
             <w:tcBorders>
               <w:start w:val="single" w:sz="4" w:space="0" w:color="000000"/>
               <w:bottom w:val="single" w:sz="4" w:space="0" w:color="000000"/>
@@ -5185,7 +5184,7 @@
                 <w:szCs w:val="24"/>
               </w:rPr>
             </w:pPr>
-            <w:bookmarkStart w:id="21" w:name="__DdeLink__587_1911333986"/>
+            <w:bookmarkStart w:id="20" w:name="__DdeLink__587_1911333986"/>
             <w:r>
               <w:rPr>
                 <w:rFonts w:cs="Sakkal Majalla" w:ascii="Sakkal Majalla" w:hAnsi="Sakkal Majalla"/>
@@ -5194,7 +5193,7 @@
               </w:rPr>
               <w:t>4B (Text+vision)</w:t>
             </w:r>
-            <w:bookmarkEnd w:id="21"/>
+            <w:bookmarkEnd w:id="20"/>
           </w:p>
         </w:tc>
         <w:tc>
@@ -5232,7 +5231,7 @@
         <w:trPr/>
         <w:tc>
           <w:tcPr>
-            <w:tcW w:w="1374" w:type="dxa"/>
+            <w:tcW w:w="1373" w:type="dxa"/>
             <w:tcBorders>
               <w:start w:val="single" w:sz="4" w:space="0" w:color="000000"/>
               <w:bottom w:val="single" w:sz="4" w:space="0" w:color="000000"/>
@@ -5263,7 +5262,7 @@
         </w:tc>
         <w:tc>
           <w:tcPr>
-            <w:tcW w:w="1356" w:type="dxa"/>
+            <w:tcW w:w="1357" w:type="dxa"/>
             <w:tcBorders>
               <w:start w:val="single" w:sz="4" w:space="0" w:color="000000"/>
               <w:bottom w:val="single" w:sz="4" w:space="0" w:color="000000"/>
@@ -5311,7 +5310,7 @@
                 <w:szCs w:val="24"/>
               </w:rPr>
             </w:pPr>
-            <w:bookmarkStart w:id="22" w:name="__DdeLink__589_1911333986"/>
+            <w:bookmarkStart w:id="21" w:name="__DdeLink__589_1911333986"/>
             <w:r>
               <w:rPr>
                 <w:rFonts w:ascii="Sakkal Majalla" w:hAnsi="Sakkal Majalla" w:cs="Sakkal Majalla"/>
@@ -5348,7 +5347,7 @@
               </w:rPr>
               <w:t>)</w:t>
             </w:r>
-            <w:bookmarkEnd w:id="22"/>
+            <w:bookmarkEnd w:id="21"/>
           </w:p>
         </w:tc>
         <w:tc>
@@ -5457,7 +5456,7 @@
                 <w:szCs w:val="24"/>
               </w:rPr>
             </w:pPr>
-            <w:bookmarkStart w:id="23" w:name="__DdeLink__585_1911333986"/>
+            <w:bookmarkStart w:id="22" w:name="__DdeLink__585_1911333986"/>
             <w:r>
               <w:rPr>
                 <w:rFonts w:cs="Sakkal Majalla" w:ascii="Sakkal Majalla" w:hAnsi="Sakkal Majalla"/>
@@ -5466,7 +5465,7 @@
               </w:rPr>
               <w:t>MedGemma</w:t>
             </w:r>
-            <w:bookmarkEnd w:id="23"/>
+            <w:bookmarkEnd w:id="22"/>
           </w:p>
         </w:tc>
       </w:tr>
@@ -5474,7 +5473,7 @@
         <w:trPr/>
         <w:tc>
           <w:tcPr>
-            <w:tcW w:w="1374" w:type="dxa"/>
+            <w:tcW w:w="1373" w:type="dxa"/>
             <w:tcBorders>
               <w:start w:val="single" w:sz="4" w:space="0" w:color="000000"/>
               <w:bottom w:val="single" w:sz="4" w:space="0" w:color="000000"/>
@@ -5505,7 +5504,7 @@
         </w:tc>
         <w:tc>
           <w:tcPr>
-            <w:tcW w:w="1356" w:type="dxa"/>
+            <w:tcW w:w="1357" w:type="dxa"/>
             <w:tcBorders>
               <w:start w:val="single" w:sz="4" w:space="0" w:color="000000"/>
               <w:bottom w:val="single" w:sz="4" w:space="0" w:color="000000"/>
@@ -5553,7 +5552,7 @@
                 <w:szCs w:val="24"/>
               </w:rPr>
             </w:pPr>
-            <w:bookmarkStart w:id="24" w:name="__DdeLink__611_3796888077"/>
+            <w:bookmarkStart w:id="23" w:name="__DdeLink__611_3796888077"/>
             <w:r>
               <w:rPr>
                 <w:rFonts w:ascii="Sakkal Majalla" w:hAnsi="Sakkal Majalla" w:cs="Sakkal Majalla"/>
@@ -5590,7 +5589,7 @@
               </w:rPr>
               <w:t>)</w:t>
             </w:r>
-            <w:bookmarkEnd w:id="24"/>
+            <w:bookmarkEnd w:id="23"/>
           </w:p>
         </w:tc>
         <w:tc>
@@ -5612,7 +5611,7 @@
                 <w:szCs w:val="24"/>
               </w:rPr>
             </w:pPr>
-            <w:bookmarkStart w:id="25" w:name="__DdeLink__609_3796888077"/>
+            <w:bookmarkStart w:id="24" w:name="__DdeLink__609_3796888077"/>
             <w:r>
               <w:rPr>
                 <w:rFonts w:ascii="Sakkal Majalla" w:hAnsi="Sakkal Majalla" w:cs="Sakkal Majalla"/>
@@ -5649,7 +5648,7 @@
               </w:rPr>
               <w:t>)</w:t>
             </w:r>
-            <w:bookmarkEnd w:id="25"/>
+            <w:bookmarkEnd w:id="24"/>
           </w:p>
         </w:tc>
         <w:tc>
@@ -5671,7 +5670,7 @@
                 <w:szCs w:val="24"/>
               </w:rPr>
             </w:pPr>
-            <w:bookmarkStart w:id="26" w:name="__DdeLink__607_3796888077"/>
+            <w:bookmarkStart w:id="25" w:name="__DdeLink__607_3796888077"/>
             <w:r>
               <w:rPr>
                 <w:rFonts w:cs="Sakkal Majalla" w:ascii="Sakkal Majalla" w:hAnsi="Sakkal Majalla"/>
@@ -5680,7 +5679,7 @@
               </w:rPr>
               <w:t>4B (Text+vision)</w:t>
             </w:r>
-            <w:bookmarkEnd w:id="26"/>
+            <w:bookmarkEnd w:id="25"/>
           </w:p>
         </w:tc>
         <w:tc>
@@ -5703,7 +5702,7 @@
                 <w:szCs w:val="24"/>
               </w:rPr>
             </w:pPr>
-            <w:bookmarkStart w:id="27" w:name="__DdeLink__605_3796888077"/>
+            <w:bookmarkStart w:id="26" w:name="__DdeLink__605_3796888077"/>
             <w:r>
               <w:rPr>
                 <w:rFonts w:cs="Sakkal Majalla" w:ascii="Sakkal Majalla" w:hAnsi="Sakkal Majalla"/>
@@ -5712,7 +5711,7 @@
               </w:rPr>
               <w:t>MedGemma-FT</w:t>
             </w:r>
-            <w:bookmarkEnd w:id="27"/>
+            <w:bookmarkEnd w:id="26"/>
           </w:p>
         </w:tc>
       </w:tr>
@@ -5720,7 +5719,7 @@
         <w:trPr/>
         <w:tc>
           <w:tcPr>
-            <w:tcW w:w="1374" w:type="dxa"/>
+            <w:tcW w:w="1373" w:type="dxa"/>
             <w:tcBorders>
               <w:start w:val="single" w:sz="4" w:space="0" w:color="000000"/>
               <w:bottom w:val="single" w:sz="4" w:space="0" w:color="000000"/>
@@ -5751,7 +5750,7 @@
         </w:tc>
         <w:tc>
           <w:tcPr>
-            <w:tcW w:w="1356" w:type="dxa"/>
+            <w:tcW w:w="1357" w:type="dxa"/>
             <w:tcBorders>
               <w:start w:val="single" w:sz="4" w:space="0" w:color="000000"/>
               <w:bottom w:val="single" w:sz="4" w:space="0" w:color="000000"/>
@@ -6929,7 +6928,7 @@
         </w:rPr>
         <w:t xml:space="preserve"> </w:t>
       </w:r>
-      <w:bookmarkStart w:id="28" w:name="__DdeLink__1082_3796888077"/>
+      <w:bookmarkStart w:id="27" w:name="__DdeLink__1082_3796888077"/>
       <w:r>
         <w:rPr>
           <w:rFonts w:ascii="Sakkal Majalla" w:hAnsi="Sakkal Majalla" w:cs="Sakkal Majalla"/>
@@ -6942,7 +6941,7 @@
         </w:rPr>
         <w:t>الخاتمة والاستنتاجات</w:t>
       </w:r>
-      <w:bookmarkEnd w:id="28"/>
+      <w:bookmarkEnd w:id="27"/>
     </w:p>
     <w:p>
       <w:pPr>
@@ -7355,9 +7354,8 @@
           <w:szCs w:val="24"/>
         </w:rPr>
       </w:r>
-      <w:bookmarkStart w:id="29" w:name="__DdeLink__1045_1329836782_Copy_1"/>
-      <w:bookmarkStart w:id="30" w:name="__DdeLink__1045_1329836782_Copy_1"/>
-      <w:bookmarkEnd w:id="30"/>
+      <w:bookmarkStart w:id="28" w:name="__DdeLink__1045_1329836782_Copy_1"/>
+      <w:bookmarkEnd w:id="28"/>
     </w:p>
     <w:p>
       <w:pPr>
@@ -8645,7 +8643,7 @@
         </w:rPr>
         <w:t>قائمة المراجع</w:t>
       </w:r>
-      <w:bookmarkStart w:id="31" w:name="__DdeLink__3493_3028478877"/>
+      <w:bookmarkStart w:id="29" w:name="__DdeLink__3493_3028478877"/>
     </w:p>
     <w:p>
       <w:pPr>
@@ -8901,30 +8899,7 @@
           <w:t>https://doi.org/10.2196/22959</w:t>
         </w:r>
       </w:hyperlink>
-    </w:p>
-    <w:p>
-      <w:pPr>
-        <w:pStyle w:val="BodyText"/>
-        <w:bidi w:val="1"/>
-        <w:spacing w:lineRule="auto" w:line="240"/>
-        <w:jc w:val="start"/>
-        <w:rPr>
-          <w:rFonts w:ascii="Sakkal Majalla" w:hAnsi="Sakkal Majalla" w:cs="Sakkal Majalla"/>
-          <w:color w:val="000000"/>
-          <w:sz w:val="24"/>
-          <w:szCs w:val="24"/>
-        </w:rPr>
-      </w:pPr>
-      <w:r>
-        <w:rPr>
-          <w:rFonts w:cs="Sakkal Majalla" w:ascii="Sakkal Majalla" w:hAnsi="Sakkal Majalla"/>
-          <w:color w:val="000000"/>
-          <w:sz w:val="24"/>
-          <w:szCs w:val="24"/>
-          <w:rtl w:val="true"/>
-        </w:rPr>
-      </w:r>
-      <w:bookmarkEnd w:id="31"/>
+      <w:bookmarkEnd w:id="29"/>
     </w:p>
     <w:p>
       <w:pPr>
@@ -8956,8 +8931,8 @@
           <w:szCs w:val="24"/>
         </w:rPr>
       </w:pPr>
-      <w:bookmarkStart w:id="32" w:name="__DdeLink__534_3515432024_Copy_1"/>
-      <w:bookmarkEnd w:id="32"/>
+      <w:bookmarkStart w:id="30" w:name="__DdeLink__534_3515432024_Copy_1"/>
+      <w:bookmarkEnd w:id="30"/>
       <w:r>
         <w:rPr>
           <w:rFonts w:ascii="Sakkal Majalla" w:hAnsi="Sakkal Majalla" w:cs="Sakkal Majalla"/>
@@ -9029,10 +9004,10 @@
           <w:szCs w:val="24"/>
         </w:rPr>
       </w:pPr>
-      <w:bookmarkStart w:id="33" w:name="__DdeLink__537_1423637023"/>
-      <w:bookmarkStart w:id="34" w:name="__DdeLink__519_1423637023"/>
-      <w:bookmarkStart w:id="35" w:name="__DdeLink__498_1423637023"/>
-      <w:bookmarkStart w:id="36" w:name="__DdeLink__232_1423637023"/>
+      <w:bookmarkStart w:id="31" w:name="__DdeLink__232_1423637023"/>
+      <w:bookmarkStart w:id="32" w:name="__DdeLink__498_1423637023"/>
+      <w:bookmarkStart w:id="33" w:name="__DdeLink__519_1423637023"/>
+      <w:bookmarkStart w:id="34" w:name="__DdeLink__537_1423637023"/>
       <w:r>
         <w:rPr>
           <w:rFonts w:ascii="Sakkal Majalla" w:hAnsi="Sakkal Majalla" w:cs="Sakkal Majalla"/>
@@ -9045,10 +9020,10 @@
         </w:rPr>
         <w:t>الملحقات</w:t>
       </w:r>
+      <w:bookmarkEnd w:id="31"/>
+      <w:bookmarkEnd w:id="32"/>
       <w:bookmarkEnd w:id="33"/>
       <w:bookmarkEnd w:id="34"/>
-      <w:bookmarkEnd w:id="35"/>
-      <w:bookmarkEnd w:id="36"/>
     </w:p>
     <w:p>
       <w:pPr>
@@ -11556,7 +11531,7 @@
     <w:pPr>
       <w:widowControl/>
       <w:suppressAutoHyphens w:val="true"/>
-      <w:overflowPunct w:val="false"/>
+      <w:overflowPunct w:val="true"/>
       <w:bidi w:val="0"/>
       <w:spacing w:lineRule="auto" w:line="278" w:before="0" w:after="160"/>
       <w:jc w:val="start"/>
@@ -12004,8 +11979,8 @@
       <w:u w:val="single"/>
     </w:rPr>
   </w:style>
-  <w:style w:type="character" w:styleId="Bulletsuser">
-    <w:name w:val="Bullets (user)"/>
+  <w:style w:type="character" w:styleId="Bullets">
+    <w:name w:val="Bullets"/>
     <w:qFormat/>
     <w:rPr>
       <w:rFonts w:ascii="OpenSymbol" w:hAnsi="OpenSymbol" w:eastAsia="OpenSymbol" w:cs="OpenSymbol"/>

</xml_diff>